<commit_message>
Copy: stop raising the tanning-bed comparison in outbound
Naming the comparison plants it, even in a denial. Answering it when a
prospect raises it first is fine; introducing it is not.

WF-22 Touch 2: "This is precision phototherapy, not a tanning bed"
  becomes "This is precision phototherapy."
WF-13: "Not a tanning bed, not a light box, not a red light panel"
  becomes "Light boxes and red light panels each do something different."

Regenerated the .docx twins for all four edited campaign files, with
table gridlines per Standing Rule 1b. WF-25 and WF-26 were left stale
by the earlier em-dash and batch-closure commits; they are in sync now.

Internal references to tanning beds are unchanged. The KB and
commercial-drip notes use the counterexample to explain why the
unqualified "delivers all three" claim is not defensible, and the
OSV staff talk track answers the question when a member asks it.

Co-Authored-By: Claude Opus 5 <noreply@anthropic.com>
</commit_message>
<xml_diff>
--- a/campaigns/WF-13-tired-test.docx
+++ b/campaigns/WF-13-tired-test.docx
@@ -585,7 +585,7 @@
         <w:rPr>
           <w:rStyle w:val="VerbatimChar"/>
         </w:rPr>
-        <w:t xml:space="preserve">We built a platform for exactly this. The Enyrgy Vitamin D Primal Light Platform delivers precise UVB and UVA through BioCalibrated Sunshine(TM), dosed to your skin type, in a two to four minute session. It triggers the same cascade real sunlight does. Not a tanning bed, not a light box, not a red light panel. Those each do something different. This runs the synthesis your body has been missing.</w:t>
+        <w:t xml:space="preserve">We built a platform for exactly this. The Enyrgy Vitamin D Primal Light Platform delivers precise UVB and UVA through BioCalibrated Sunshine(TM), dosed to your skin type, in a two to four minute session. It triggers the same cascade real sunlight does. Light boxes and red light panels each do something different. This runs the synthesis your body has been missing.</w:t>
       </w:r>
       <w:r>
         <w:br/>
@@ -834,16 +834,16 @@
     </w:p>
     <w:tbl>
       <w:tblPr>
-        <w:tblBorders>
-          <w:top w:val="single" w:sz="6" w:space="0" w:color="AAAAAA"/>
-          <w:left w:val="single" w:sz="6" w:space="0" w:color="AAAAAA"/>
-          <w:bottom w:val="single" w:sz="6" w:space="0" w:color="AAAAAA"/>
-          <w:right w:val="single" w:sz="6" w:space="0" w:color="AAAAAA"/>
-          <w:insideH w:val="single" w:sz="6" w:space="0" w:color="AAAAAA"/>
-          <w:insideV w:val="single" w:sz="6" w:space="0" w:color="AAAAAA"/>
-        </w:tblBorders>
         <w:tblStyle w:val="Table"/>
         <w:tblW w:type="pct" w:w="5000"/>
+        <w:tblBorders>
+          <w:top w:val="single" w:sz="4" w:space="0" w:color="auto"/>
+          <w:left w:val="single" w:sz="4" w:space="0" w:color="auto"/>
+          <w:bottom w:val="single" w:sz="4" w:space="0" w:color="auto"/>
+          <w:right w:val="single" w:sz="4" w:space="0" w:color="auto"/>
+          <w:insideH w:val="single" w:sz="4" w:space="0" w:color="auto"/>
+          <w:insideV w:val="single" w:sz="4" w:space="0" w:color="auto"/>
+        </w:tblBorders>
         <w:tblLayout w:type="fixed"/>
         <w:tblLook w:firstRow="1" w:lastRow="0" w:firstColumn="0" w:lastColumn="0" w:noHBand="0" w:noVBand="0" w:val="0020"/>
       </w:tblPr>

</xml_diff>

<commit_message>
Campaigns: log the Aug 18 tanning-bed removal in WF-13 and WF-22
Both workflows keep a dated change log with a touch-level table and
narrative sections. The Aug 18 correction was only in git history, so
it is now recorded where the previous corrections are, newest first
above the existing Aug 2 and Aug 3 logs.

Each entry records that the change is live in GHL as of 2026-08-18,
and restates the rule: never raise the tanning-bed comparison in
outbound copy, even to deny it, but answer it when a prospect raises
it first. WF-22's inline CORRECTED note now points at the log, matching
how the Aug 3 corrections cross-reference.

Regenerated both .docx twins, two gridlined tables each.

Co-Authored-By: Claude Opus 5 <noreply@anthropic.com>
</commit_message>
<xml_diff>
--- a/campaigns/WF-13-tired-test.docx
+++ b/campaigns/WF-13-tired-test.docx
@@ -823,7 +823,193 @@
     </w:p>
     <w:bookmarkEnd w:id="13"/>
     <w:bookmarkEnd w:id="14"/>
-    <w:bookmarkStart w:id="18" w:name="change-log-2026-08-02"/>
+    <w:bookmarkStart w:id="16" w:name="change-log-2026-08-18"/>
+    <w:p>
+      <w:pPr>
+        <w:pStyle w:val="Heading1"/>
+      </w:pPr>
+      <w:r>
+        <w:t xml:space="preserve">Change log, 2026-08-18</w:t>
+      </w:r>
+    </w:p>
+    <w:tbl>
+      <w:tblPr>
+        <w:tblStyle w:val="Table"/>
+        <w:tblW w:type="pct" w:w="5000"/>
+        <w:tblBorders>
+          <w:top w:val="single" w:sz="4" w:space="0" w:color="auto"/>
+          <w:left w:val="single" w:sz="4" w:space="0" w:color="auto"/>
+          <w:bottom w:val="single" w:sz="4" w:space="0" w:color="auto"/>
+          <w:right w:val="single" w:sz="4" w:space="0" w:color="auto"/>
+          <w:insideH w:val="single" w:sz="4" w:space="0" w:color="auto"/>
+          <w:insideV w:val="single" w:sz="4" w:space="0" w:color="auto"/>
+        </w:tblBorders>
+        <w:tblLayout w:type="fixed"/>
+        <w:tblLook w:firstRow="1" w:lastRow="0" w:firstColumn="0" w:lastColumn="0" w:noHBand="0" w:noVBand="0" w:val="0020"/>
+      </w:tblPr>
+      <w:tblGrid>
+        <w:gridCol w:w="2640"/>
+        <w:gridCol w:w="2640"/>
+        <w:gridCol w:w="2640"/>
+      </w:tblGrid>
+      <w:tr>
+        <w:trPr>
+          <w:tblHeader w:val="on"/>
+        </w:trPr>
+        <w:tc>
+          <w:tcPr/>
+          <w:p>
+            <w:pPr>
+              <w:pStyle w:val="Compact"/>
+            </w:pPr>
+            <w:r>
+              <w:t xml:space="preserve">#</w:t>
+            </w:r>
+          </w:p>
+        </w:tc>
+        <w:tc>
+          <w:tcPr/>
+          <w:p>
+            <w:pPr>
+              <w:pStyle w:val="Compact"/>
+            </w:pPr>
+            <w:r>
+              <w:t xml:space="preserve">Touch</w:t>
+            </w:r>
+          </w:p>
+        </w:tc>
+        <w:tc>
+          <w:tcPr/>
+          <w:p>
+            <w:pPr>
+              <w:pStyle w:val="Compact"/>
+            </w:pPr>
+            <w:r>
+              <w:t xml:space="preserve">Change</w:t>
+            </w:r>
+          </w:p>
+        </w:tc>
+      </w:tr>
+      <w:tr>
+        <w:tc>
+          <w:tcPr/>
+          <w:p>
+            <w:pPr>
+              <w:pStyle w:val="Compact"/>
+            </w:pPr>
+            <w:r>
+              <w:t xml:space="preserve">1</w:t>
+            </w:r>
+          </w:p>
+        </w:tc>
+        <w:tc>
+          <w:tcPr/>
+          <w:p>
+            <w:pPr>
+              <w:pStyle w:val="Compact"/>
+            </w:pPr>
+            <w:r>
+              <w:t xml:space="preserve">4</w:t>
+            </w:r>
+          </w:p>
+        </w:tc>
+        <w:tc>
+          <w:tcPr/>
+          <w:p>
+            <w:pPr>
+              <w:pStyle w:val="Compact"/>
+            </w:pPr>
+            <w:r>
+              <w:t xml:space="preserve">“Not a tanning bed, not a light box, not a red light panel”</w:t>
+            </w:r>
+            <w:r>
+              <w:t xml:space="preserve"> </w:t>
+            </w:r>
+            <w:r>
+              <w:t xml:space="preserve">replaced with</w:t>
+            </w:r>
+            <w:r>
+              <w:t xml:space="preserve"> </w:t>
+            </w:r>
+            <w:r>
+              <w:t xml:space="preserve">“Light boxes and red light panels each do something different”</w:t>
+            </w:r>
+          </w:p>
+        </w:tc>
+      </w:tr>
+    </w:tbl>
+    <w:p>
+      <w:pPr>
+        <w:pStyle w:val="BodyText"/>
+      </w:pPr>
+      <w:r>
+        <w:rPr>
+          <w:b/>
+          <w:bCs/>
+        </w:rPr>
+        <w:t xml:space="preserve">Live in GHL as of 2026-08-18.</w:t>
+      </w:r>
+    </w:p>
+    <w:bookmarkStart w:id="15" w:name="naming-the-comparison-plants-it"/>
+    <w:p>
+      <w:pPr>
+        <w:pStyle w:val="Heading2"/>
+      </w:pPr>
+      <w:r>
+        <w:t xml:space="preserve">Naming the comparison plants it</w:t>
+      </w:r>
+    </w:p>
+    <w:p>
+      <w:pPr>
+        <w:pStyle w:val="FirstParagraph"/>
+      </w:pPr>
+      <w:r>
+        <w:t xml:space="preserve">Scott’s rule, and it is now in the brand style guide under Brand Positioning: never put the tanning-bed comparison in a prospect’s mind, in any form, including a denial. A reader who was not thinking about tanning beds is thinking about them the moment the sentence names one, and the association survives the</w:t>
+      </w:r>
+      <w:r>
+        <w:t xml:space="preserve"> </w:t>
+      </w:r>
+      <w:r>
+        <w:t xml:space="preserve">“not”</w:t>
+      </w:r>
+      <w:r>
+        <w:t xml:space="preserve">.</w:t>
+      </w:r>
+    </w:p>
+    <w:p>
+      <w:pPr>
+        <w:pStyle w:val="BodyText"/>
+      </w:pPr>
+      <w:r>
+        <w:t xml:space="preserve">This instance was the worse of the two found. It led with the comparison rather than mentioning it in passing, and it stacked three denials in a row, which reads as defensive about a charge nobody made.</w:t>
+      </w:r>
+    </w:p>
+    <w:p>
+      <w:pPr>
+        <w:pStyle w:val="BodyText"/>
+      </w:pPr>
+      <w:r>
+        <w:t xml:space="preserve">The two contrasts worth keeping are light boxes and red light panels. Customers genuinely conflate those with the platform, the distinction is real, and neither carries an association worth avoiding. Dropping only the first item leaves the sentence doing the same work with none of the cost.</w:t>
+      </w:r>
+    </w:p>
+    <w:p>
+      <w:pPr>
+        <w:pStyle w:val="BodyText"/>
+      </w:pPr>
+      <w:r>
+        <w:t xml:space="preserve">Answering the comparison is still correct when a prospect raises it first. The knowledge base objection script and the OSV staff talk track both handle it. The rule is about who introduces it.</w:t>
+      </w:r>
+    </w:p>
+    <w:p>
+      <w:r>
+        <w:pict>
+          <v:rect style="width:0;height:1.5pt" o:hralign="center" o:hrstd="t" o:hr="t"/>
+        </w:pict>
+      </w:r>
+    </w:p>
+    <w:bookmarkEnd w:id="15"/>
+    <w:bookmarkEnd w:id="16"/>
+    <w:bookmarkStart w:id="20" w:name="change-log-2026-08-02"/>
     <w:p>
       <w:pPr>
         <w:pStyle w:val="Heading1"/>
@@ -1008,7 +1194,7 @@
         </w:tc>
       </w:tr>
     </w:tbl>
-    <w:bookmarkStart w:id="15" w:name="the-mangled-sentence-and-why-it-survived"/>
+    <w:bookmarkStart w:id="17" w:name="the-mangled-sentence-and-why-it-survived"/>
     <w:p>
       <w:pPr>
         <w:pStyle w:val="Heading2"/>
@@ -1092,8 +1278,8 @@
         <w:t xml:space="preserve">, which is exactly why a compliance audit scans past it. It only surfaces when someone reads the sentence as a sentence rather than as a set of claims. Same class of miss as the duplicated merge fields in the Commercial Drip subject lines.</w:t>
       </w:r>
     </w:p>
-    <w:bookmarkEnd w:id="15"/>
-    <w:bookmarkStart w:id="16" w:name="the-nitric-oxide-drift"/>
+    <w:bookmarkEnd w:id="17"/>
+    <w:bookmarkStart w:id="18" w:name="the-nitric-oxide-drift"/>
     <w:p>
       <w:pPr>
         <w:pStyle w:val="Heading2"/>
@@ -1130,8 +1316,8 @@
         <w:t xml:space="preserve">Beyond being off-spec, it weakened the argument. The Triple-Pathway case rests on each pathway doing a distinct job, and handing the same benefit to two of them blurs the distinction the email is built on.</w:t>
       </w:r>
     </w:p>
-    <w:bookmarkEnd w:id="16"/>
-    <w:bookmarkStart w:id="17" w:name="the-guarantee-decoupling"/>
+    <w:bookmarkEnd w:id="18"/>
+    <w:bookmarkStart w:id="19" w:name="the-guarantee-decoupling"/>
     <w:p>
       <w:pPr>
         <w:pStyle w:val="Heading2"/>
@@ -1180,8 +1366,8 @@
         <w:t xml:space="preserve">; it has now been found still coupled, or ambiguously coupled, in three separate places.</w:t>
       </w:r>
     </w:p>
-    <w:bookmarkEnd w:id="17"/>
-    <w:bookmarkEnd w:id="18"/>
+    <w:bookmarkEnd w:id="19"/>
+    <w:bookmarkEnd w:id="20"/>
     <w:sectPr>
       <w:footnotePr>
         <w:numRestart w:val="eachSect"/>

</xml_diff>

<commit_message>
WF-13: actually add the WF-12 capture-email flag
The previous commit's message said this was flagged. The edit had failed its
assertion on an anchor that does not exist in that file, the traceback scrolled
past under the pandoc output, and I committed on the strength of the message
rather than the result. The record claimed something the repo did not contain,
which is worse than the omission.

Flag now present: WF-12 has no email action, so the first thing a Tired Test
lead hears is WF-13 touch 1 at Day 1, while WF-02's five-minute SMS tells them
to check their email now.

Co-Authored-By: Claude Opus 5 <noreply@anthropic.com>
</commit_message>
<xml_diff>
--- a/campaigns/WF-13-tired-test.docx
+++ b/campaigns/WF-13-tired-test.docx
@@ -823,7 +823,118 @@
     </w:p>
     <w:bookmarkEnd w:id="23"/>
     <w:bookmarkEnd w:id="24"/>
-    <w:bookmarkStart w:id="26" w:name="change-log-2026-08-18"/>
+    <w:bookmarkStart w:id="25" w:name="X5fc43683d8b975533f4a8269bbf34c30789ae1b"/>
+    <w:p>
+      <w:pPr>
+        <w:pStyle w:val="Heading1"/>
+      </w:pPr>
+      <w:r>
+        <w:t xml:space="preserve">OPEN, noticed Aug 26: WF-12 sends nothing at capture</w:t>
+      </w:r>
+    </w:p>
+    <w:p>
+      <w:pPr>
+        <w:pStyle w:val="FirstParagraph"/>
+      </w:pPr>
+      <w:r>
+        <w:rPr>
+          <w:b/>
+          <w:bCs/>
+        </w:rPr>
+        <w:t xml:space="preserve">WF-12 Tired Test Lead Magnet is Inbound Webhook, Create contact, Add Tag, Add Dynamic Tags, Assign to Millie, END.</w:t>
+      </w:r>
+      <w:r>
+        <w:t xml:space="preserve"> </w:t>
+      </w:r>
+      <w:r>
+        <w:t xml:space="preserve">There is no email action in it. The first thing a Tired Test lead hears from GHL is</w:t>
+      </w:r>
+      <w:r>
+        <w:t xml:space="preserve"> </w:t>
+      </w:r>
+      <w:r>
+        <w:rPr>
+          <w:b/>
+          <w:bCs/>
+        </w:rPr>
+        <w:t xml:space="preserve">WF-13 touch 1, at Day 1.</w:t>
+      </w:r>
+    </w:p>
+    <w:p>
+      <w:pPr>
+        <w:pStyle w:val="BodyText"/>
+      </w:pPr>
+      <w:r>
+        <w:rPr>
+          <w:b/>
+          <w:bCs/>
+        </w:rPr>
+        <w:t xml:space="preserve">Why that is worth checking.</w:t>
+      </w:r>
+      <w:r>
+        <w:t xml:space="preserve"> </w:t>
+      </w:r>
+      <w:r>
+        <w:t xml:space="preserve">WF-02’s five-minute SMS tells consumer leads</w:t>
+      </w:r>
+      <w:r>
+        <w:t xml:space="preserve"> </w:t>
+      </w:r>
+      <w:r>
+        <w:rPr>
+          <w:i/>
+          <w:iCs/>
+        </w:rPr>
+        <w:t xml:space="preserve">“Check your email, I am sending you something that might finally explain why.”</w:t>
+      </w:r>
+      <w:r>
+        <w:t xml:space="preserve"> </w:t>
+      </w:r>
+      <w:r>
+        <w:t xml:space="preserve">The note in</w:t>
+      </w:r>
+      <w:r>
+        <w:t xml:space="preserve"> </w:t>
+      </w:r>
+      <w:r>
+        <w:rPr>
+          <w:rStyle w:val="VerbatimChar"/>
+        </w:rPr>
+        <w:t xml:space="preserve">campaigns/WF-02-five-minute-sms.md</w:t>
+      </w:r>
+      <w:r>
+        <w:t xml:space="preserve"> </w:t>
+      </w:r>
+      <w:r>
+        <w:t xml:space="preserve">justifies that line on the grounds that WF-12, 15, 18, 19 and 21 all send their guide or results email at capture. For WF-12 that is not true on the canvas.</w:t>
+      </w:r>
+    </w:p>
+    <w:p>
+      <w:pPr>
+        <w:pStyle w:val="BodyText"/>
+      </w:pPr>
+      <w:r>
+        <w:t xml:space="preserve">Either the Tired Test page delivers the guide itself at submission, in which case the promise is kept and only our note is wrong, or a lead who receives that SMS is pointed at an inbox that stays empty for up to a day, which breaks a promise at the very first touch.</w:t>
+      </w:r>
+      <w:r>
+        <w:t xml:space="preserve"> </w:t>
+      </w:r>
+      <w:r>
+        <w:rPr>
+          <w:b/>
+          <w:bCs/>
+        </w:rPr>
+        <w:t xml:space="preserve">Check the page, not the workflow.</w:t>
+      </w:r>
+      <w:r>
+        <w:t xml:space="preserve"> </w:t>
+      </w:r>
+      <w:r>
+        <w:t xml:space="preserve">The other four capture workflows deserve the same look.</w:t>
+      </w:r>
+    </w:p>
+    <w:bookmarkEnd w:id="25"/>
+    <w:bookmarkStart w:id="27" w:name="change-log-2026-08-18"/>
     <w:p>
       <w:pPr>
         <w:pStyle w:val="Heading1"/>
@@ -950,7 +1061,7 @@
         <w:t xml:space="preserve">Live in GHL as of 2026-08-18.</w:t>
       </w:r>
     </w:p>
-    <w:bookmarkStart w:id="25" w:name="naming-the-comparison-plants-it"/>
+    <w:bookmarkStart w:id="26" w:name="naming-the-comparison-plants-it"/>
     <w:p>
       <w:pPr>
         <w:pStyle w:val="Heading2"/>
@@ -1007,9 +1118,9 @@
         </w:pict>
       </w:r>
     </w:p>
-    <w:bookmarkEnd w:id="25"/>
     <w:bookmarkEnd w:id="26"/>
-    <w:bookmarkStart w:id="30" w:name="change-log-2026-08-02"/>
+    <w:bookmarkEnd w:id="27"/>
+    <w:bookmarkStart w:id="31" w:name="change-log-2026-08-02"/>
     <w:p>
       <w:pPr>
         <w:pStyle w:val="Heading1"/>
@@ -1194,7 +1305,7 @@
         </w:tc>
       </w:tr>
     </w:tbl>
-    <w:bookmarkStart w:id="27" w:name="the-mangled-sentence-and-why-it-survived"/>
+    <w:bookmarkStart w:id="28" w:name="the-mangled-sentence-and-why-it-survived"/>
     <w:p>
       <w:pPr>
         <w:pStyle w:val="Heading2"/>
@@ -1278,8 +1389,8 @@
         <w:t xml:space="preserve">, which is exactly why a compliance audit scans past it. It only surfaces when someone reads the sentence as a sentence rather than as a set of claims. Same class of miss as the duplicated merge fields in the Commercial Drip subject lines.</w:t>
       </w:r>
     </w:p>
-    <w:bookmarkEnd w:id="27"/>
-    <w:bookmarkStart w:id="28" w:name="the-nitric-oxide-drift"/>
+    <w:bookmarkEnd w:id="28"/>
+    <w:bookmarkStart w:id="29" w:name="the-nitric-oxide-drift"/>
     <w:p>
       <w:pPr>
         <w:pStyle w:val="Heading2"/>
@@ -1316,8 +1427,8 @@
         <w:t xml:space="preserve">Beyond being off-spec, it weakened the argument. The Triple-Pathway case rests on each pathway doing a distinct job, and handing the same benefit to two of them blurs the distinction the email is built on.</w:t>
       </w:r>
     </w:p>
-    <w:bookmarkEnd w:id="28"/>
-    <w:bookmarkStart w:id="29" w:name="the-guarantee-decoupling"/>
+    <w:bookmarkEnd w:id="29"/>
+    <w:bookmarkStart w:id="30" w:name="the-guarantee-decoupling"/>
     <w:p>
       <w:pPr>
         <w:pStyle w:val="Heading2"/>
@@ -1366,8 +1477,8 @@
         <w:t xml:space="preserve">; it has now been found still coupled, or ambiguously coupled, in three separate places.</w:t>
       </w:r>
     </w:p>
-    <w:bookmarkEnd w:id="29"/>
     <w:bookmarkEnd w:id="30"/>
+    <w:bookmarkEnd w:id="31"/>
     <w:sectPr>
       <w:headerReference r:id="rId9" w:type="default"/>
       <w:footerReference r:id="rId10" w:type="default"/>

</xml_diff>